<commit_message>
Align RFR forms and website with v7.2 safeguards
</commit_message>
<xml_diff>
--- a/forms/08.26.26_01_Customer_Intake_Form.docx
+++ b/forms/08.26.26_01_Customer_Intake_Form.docx
@@ -42,7 +42,7 @@
           <w:color w:val="646464"/>
           <w:sz w:val="16"/>
         </w:rPr>
-        <w:t>Pilot Forms v1.0 | August 21, 2026</w:t>
+        <w:t>Pilot Forms v1.1 | September 9, 2026</w:t>
       </w:r>
     </w:p>
     <w:p>
@@ -689,11 +689,9 @@
         <w:rPr>
           <w:b/>
         </w:rPr>
-        <w:t xml:space="preserve">[ ] </w:t>
+        <w:t>[ ] Active or reasonably anticipated litigation / legal-dispute material</w:t>
       </w:r>
-      <w:r>
-        <w:t>Legal / dispute-related material</w:t>
-      </w:r>
+      <w:r/>
     </w:p>
     <w:p>
       <w:pPr>
@@ -822,7 +820,7 @@
         <w:color w:val="6E6E6E"/>
         <w:sz w:val="15"/>
       </w:rPr>
-      <w:t>Raw File Rescue | Customer Intake Form | Pilot Forms v1.0</w:t>
+      <w:t>Raw File Rescue | Customer Intake Form | Pilot Forms v1.1</w:t>
     </w:r>
   </w:p>
 </w:ftr>

</xml_diff>